<commit_message>
fix: 手册第02卡补充 MTTF 全称（Mean Time To Failure）
</commit_message>
<xml_diff>
--- a/source/Minitab应用实战手册_V1.5_OpenClaw版.docx
+++ b/source/Minitab应用实战手册_V1.5_OpenClaw版.docx
@@ -12661,11 +12661,7 @@
     </w:p>
     <w:p>
       <w:r>
-        <w:rPr>
-          <w:rFonts w:ascii="微软雅黑" w:hAnsi="微软雅黑" w:eastAsia="微软雅黑"/>
-          <w:sz w:val="19"/>
-        </w:rPr>
-        <w:t>B10 = 总体中 10% 产品失效对应的次数，即该时间点可靠度 R=90%。源于轴承行业"BX 寿命"概念。传音场景：统一案例 W-795 跌落数据跑 Weibull（MLE 估计），B10=2.72 次→预计 10% 手机在 2.72 次跌落后失效。对比：MTTF≈7.55 次是"平均寿命"，B50=7.06 次是"中位寿命"（50% 失效）。但 Weibull 分布下同样 MTTF 的两批产品失效模式可能完全不同，B10 更适合做质量决策和保修期设定。思考题：B50=7.06 和 B10=2.72 哪个更大？（答案：B50，因为失效次数越往后累积越多）</w:t>
+        <w:t>B10 = 总体中 10% 产品失效对应的次数，即该时间点可靠度 R=90%。源于轴承行业"BX 寿命"概念。传音场景：统一案例 W-795 跌落数据跑 Weibull（MLE 估计），B10=2.72 次→预计 10% 手机在 2.72 次跌落后失效。对比：MTTF（Mean Time To Failure，平均失效前时间）≈7.55 次是"平均寿命"，B50=7.06 次是"中位寿命"（50% 失效）。但 Weibull 分布下同样 MTTF 的两批产品失效模式可能完全不同，B10 更适合做质量决策和保修期设定。思考题：B50=7.06 和 B10=2.72 哪个更大？（答案：B50，因为失效次数越往后累积越多）</w:t>
       </w:r>
     </w:p>
     <w:p/>

</xml_diff>

<commit_message>
fix: 统一数据 - B10=2.56098, β=1.88, p=0.019, Cpk图片说明=3.07
</commit_message>
<xml_diff>
--- a/source/Minitab应用实战手册_V1.5_OpenClaw版.docx
+++ b/source/Minitab应用实战手册_V1.5_OpenClaw版.docx
@@ -5124,52 +5124,12 @@
     </w:p>
     <w:p>
       <w:r>
-        <w:rPr>
-          <w:rFonts w:ascii="微软雅黑" w:hAnsi="微软雅黑" w:eastAsia="微软雅黑"/>
-          <w:sz w:val="19"/>
-        </w:rPr>
         <w:t>现象：Weibull 分析结果 β=9.55（或 &gt;5），η=5.15，明显不合理。AD 值异常巨大（如 29.8）。</w:t>
-      </w:r>
-      <w:r>
-        <w:rPr>
-          <w:rFonts w:ascii="微软雅黑" w:hAnsi="微软雅黑" w:eastAsia="微软雅黑"/>
-          <w:sz w:val="19"/>
-        </w:rPr>
-        <w:br w:type="textWrapping"/>
-      </w:r>
-      <w:r>
-        <w:rPr>
-          <w:rFonts w:ascii="微软雅黑" w:hAnsi="微软雅黑" w:eastAsia="微软雅黑"/>
-          <w:sz w:val="19"/>
-        </w:rPr>
+        <w:br/>
         <w:t>根因：失效数据高度集中在 2~3 个值（如本例只有 4 和 5 两个值），最小二乘(LSXY)估计对这种数据极不稳定，会把 β 算崩。</w:t>
-      </w:r>
-      <w:r>
-        <w:rPr>
-          <w:rFonts w:ascii="微软雅黑" w:hAnsi="微软雅黑" w:eastAsia="微软雅黑"/>
-          <w:sz w:val="19"/>
-        </w:rPr>
-        <w:br w:type="textWrapping"/>
-      </w:r>
-      <w:r>
-        <w:rPr>
-          <w:rFonts w:ascii="微软雅黑" w:hAnsi="微软雅黑" w:eastAsia="微软雅黑"/>
-          <w:sz w:val="19"/>
-        </w:rPr>
-        <w:t>正确做法：在分布分析对话框点「估计」选项卡，将估计方法从"最小二乘"改为"极大似然(MLE)"。MLE 对集中数据更稳健，本例改 MLE 后 β=1.98（合理的磨损失效）。</w:t>
-      </w:r>
-      <w:r>
-        <w:rPr>
-          <w:rFonts w:ascii="微软雅黑" w:hAnsi="微软雅黑" w:eastAsia="微软雅黑"/>
-          <w:sz w:val="19"/>
-        </w:rPr>
-        <w:br w:type="textWrapping"/>
-      </w:r>
-      <w:r>
-        <w:rPr>
-          <w:rFonts w:ascii="微软雅黑" w:hAnsi="微软雅黑" w:eastAsia="微软雅黑"/>
-          <w:sz w:val="19"/>
-        </w:rPr>
+        <w:br/>
+        <w:t>正确做法：在分布分析对话框点「估计」选项卡，将估计方法从"最小二乘"改为"极大似然(MLE)"。MLE 对集中数据更稳健，本例改 MLE 后 β=1.88（合理的磨损失效）。</w:t>
+        <w:br/>
         <w:t>补充：数据集中时 AD 也会飙到 20+，这是 AD 对数据集中敏感的特性，不代表拟合差——此时优先看概率图目视判断（点是否贴近线），而非死磕 AD 数值。</w:t>
       </w:r>
     </w:p>
@@ -9137,11 +9097,7 @@
     </w:p>
     <w:p>
       <w:r>
-        <w:rPr>
-          <w:rFonts w:ascii="微软雅黑" w:hAnsi="微软雅黑" w:eastAsia="微软雅黑"/>
-          <w:sz w:val="20"/>
-        </w:rPr>
-        <w:t>"整改前后各测30台，Kaplan-Meier 分析：Log-Rank p=0.003，整改有统计显著改善，可放行量产。"</w:t>
+        <w:t>"整改前后各测30台，Kaplan-Meier 分析：Log-Rank p=0.019，整改有统计显著改善，可放行量产。"</w:t>
       </w:r>
     </w:p>
     <w:p/>
@@ -12465,81 +12421,17 @@
     </w:p>
     <w:p>
       <w:r>
-        <w:rPr>
-          <w:rFonts w:ascii="微软雅黑" w:hAnsi="微软雅黑" w:eastAsia="微软雅黑"/>
-          <w:sz w:val="19"/>
-        </w:rPr>
         <w:t>以下卡片共用同一套主线数据，读者可以跟着卡片顺序，在 Minitab 里用同一批数据反复练手。数据如下：</w:t>
-      </w:r>
-      <w:r>
-        <w:rPr>
-          <w:rFonts w:ascii="微软雅黑" w:hAnsi="微软雅黑" w:eastAsia="微软雅黑"/>
-          <w:sz w:val="19"/>
-        </w:rPr>
-        <w:br w:type="textWrapping"/>
-      </w:r>
-      <w:r>
-        <w:rPr>
-          <w:rFonts w:ascii="微软雅黑" w:hAnsi="微软雅黑" w:eastAsia="微软雅黑"/>
-          <w:sz w:val="19"/>
-        </w:rPr>
+        <w:br/>
         <w:t xml:space="preserve">  12 台手机做 1m 大理石受控跌落，最多跌 10 次。</w:t>
-      </w:r>
-      <w:r>
-        <w:rPr>
-          <w:rFonts w:ascii="微软雅黑" w:hAnsi="微软雅黑" w:eastAsia="微软雅黑"/>
-          <w:sz w:val="19"/>
-        </w:rPr>
-        <w:br w:type="textWrapping"/>
-      </w:r>
-      <w:r>
-        <w:rPr>
-          <w:rFonts w:ascii="微软雅黑" w:hAnsi="微软雅黑" w:eastAsia="微软雅黑"/>
-          <w:sz w:val="19"/>
-        </w:rPr>
+        <w:br/>
         <w:t xml:space="preserve">  · 3 台第 4 次失效（屏幕碎裂）</w:t>
-      </w:r>
-      <w:r>
-        <w:rPr>
-          <w:rFonts w:ascii="微软雅黑" w:hAnsi="微软雅黑" w:eastAsia="微软雅黑"/>
-          <w:sz w:val="19"/>
-        </w:rPr>
-        <w:br w:type="textWrapping"/>
-      </w:r>
-      <w:r>
-        <w:rPr>
-          <w:rFonts w:ascii="微软雅黑" w:hAnsi="微软雅黑" w:eastAsia="微软雅黑"/>
-          <w:sz w:val="19"/>
-        </w:rPr>
+        <w:br/>
         <w:t xml:space="preserve">  · 5 台第 5 次失效（屏幕碎裂）</w:t>
-      </w:r>
-      <w:r>
-        <w:rPr>
-          <w:rFonts w:ascii="微软雅黑" w:hAnsi="微软雅黑" w:eastAsia="微软雅黑"/>
-          <w:sz w:val="19"/>
-        </w:rPr>
-        <w:br w:type="textWrapping"/>
-      </w:r>
-      <w:r>
-        <w:rPr>
-          <w:rFonts w:ascii="微软雅黑" w:hAnsi="微软雅黑" w:eastAsia="微软雅黑"/>
-          <w:sz w:val="19"/>
-        </w:rPr>
+        <w:br/>
         <w:t xml:space="preserve">  · 4 台坚持到 10 次全过（右删失）</w:t>
-      </w:r>
-      <w:r>
-        <w:rPr>
-          <w:rFonts w:ascii="微软雅黑" w:hAnsi="微软雅黑" w:eastAsia="微软雅黑"/>
-          <w:sz w:val="19"/>
-        </w:rPr>
-        <w:br w:type="textWrapping"/>
-      </w:r>
-      <w:r>
-        <w:rPr>
-          <w:rFonts w:ascii="微软雅黑" w:hAnsi="微软雅黑" w:eastAsia="微软雅黑"/>
-          <w:sz w:val="19"/>
-        </w:rPr>
-        <w:t>Weibull 分析结果（MLE 估计）：失效数=8，删失数=4；β=1.98（磨损失效），η=8.50；B10=2.72 次，B50=7.06 次。</w:t>
+        <w:br/>
+        <w:t>Weibull 分析结果（MLE 估计）：失效数=8，删失数=4；β=1.88（磨损失效），η=8.50；B10=2.56098 次，B50=7.06 次。</w:t>
       </w:r>
     </w:p>
     <w:p>
@@ -12583,7 +12475,7 @@
     </w:p>
     <w:p>
       <w:r>
-        <w:t>B10 = 总体中 10% 产品失效对应的次数，即该时间点可靠度 R=90%。源于轴承行业"BX 寿命"概念。传音场景：统一案例 W-795 跌落数据跑 Weibull（MLE 估计），B10=2.72 次→预计 10% 手机在 2.72 次跌落后失效。对比：MTTF（Mean Time To Failure，平均失效前时间）≈7.55 次是"平均寿命"，B50=7.06 次是"中位寿命"（50% 失效）。但 Weibull 分布下同样 MTTF 的两批产品失效模式可能完全不同，B10 更适合做质量决策和保修期设定。思考题：B50=7.06 和 B10=2.72 哪个更大？（答案：B50，因为失效次数越往后累积越多）</w:t>
+        <w:t>B10 = 总体中 10% 产品失效对应的次数，即该时间点可靠度 R=90%。源于轴承行业"BX 寿命"概念。传音场景：统一案例 W-795 跌落数据跑 Weibull（MLE 估计），B10=2.56098 次→预计 10% 手机在 2.56098 次跌落后失效。对比：MTTF（Mean Time To Failure，平均失效前时间）≈7.55 次是"平均寿命"，B50=7.06 次是"中位寿命"（50% 失效）。但 Weibull 分布下同样 MTTF 的两批产品失效模式可能完全不同，B10 更适合做质量决策和保修期设定。思考题：B50=7.06 和 B10=2.56098 哪个更大？（答案：B50，因为失效次数越往后累积越多）</w:t>
       </w:r>
     </w:p>
     <w:p/>
@@ -13537,11 +13429,7 @@
     </w:p>
     <w:p>
       <w:r>
-        <w:rPr>
-          <w:rFonts w:ascii="微软雅黑" w:hAnsi="微软雅黑" w:eastAsia="微软雅黑"/>
-          <w:sz w:val="19"/>
-        </w:rPr>
-        <w:t>β&lt;1=早期失效(查来料)；β=1=随机失效；β&gt;1=磨损型失效(查设计)。传音场景：统一案例 W-795 跌落 12 台数据，Weibull 分析（MLE 估计）输出 β=1.98，β&gt;1 且数据未显示混合失效模式→磨损失效，失效根因在于设计/工艺，而非来料。</w:t>
+        <w:t>β&lt;1=早期失效(查来料)；β=1=随机失效；β&gt;1=磨损型失效(查设计)。传音场景：统一案例 W-795 跌落 12 台数据，Weibull 分析（MLE 估计）输出 β=1.88，β&gt;1 且数据未显示混合失效模式→磨损失效，失效根因在于设计/工艺，而非来料。</w:t>
       </w:r>
     </w:p>
     <w:p>
@@ -13563,128 +13451,12 @@
         </w:rPr>
       </w:pPr>
       <w:r>
-        <w:rPr>
-          <w:rFonts w:ascii="微软雅黑" w:hAnsi="微软雅黑" w:eastAsia="微软雅黑"/>
-          <w:sz w:val="19"/>
-        </w:rPr>
         <w:t>接第03卡的数据和菜单，在输出窗口找"形状参数"行。</w:t>
-      </w:r>
-      <w:r>
-        <w:rPr>
-          <w:rFonts w:ascii="微软雅黑" w:hAnsi="微软雅黑" w:eastAsia="微软雅黑"/>
-          <w:sz w:val="19"/>
-        </w:rPr>
-        <w:br w:type="textWrapping"/>
-      </w:r>
-      <w:r>
-        <w:rPr>
-          <w:rFonts w:ascii="微软雅黑" w:hAnsi="微软雅黑" w:eastAsia="微软雅黑"/>
-          <w:sz w:val="19"/>
-        </w:rPr>
-        <w:t>统一案例结果（MLE）：β=1.98，η=8.50，B10=</w:t>
-      </w:r>
-      <w:r>
-        <w:rPr>
-          <w:rFonts w:ascii="微软雅黑" w:hAnsi="微软雅黑" w:eastAsia="微软雅黑"/>
-          <w:sz w:val="19"/>
-          <w:lang w:val="en-US" w:eastAsia="zh-CN"/>
-        </w:rPr>
-        <w:t>2.56098</w:t>
-      </w:r>
-      <w:r>
-        <w:rPr>
-          <w:rFonts w:ascii="微软雅黑" w:hAnsi="微软雅黑" w:eastAsia="微软雅黑"/>
-          <w:sz w:val="19"/>
-        </w:rPr>
-        <w:t>，B50=</w:t>
-      </w:r>
-      <w:r>
-        <w:rPr>
-          <w:rFonts w:hint="eastAsia" w:ascii="微软雅黑" w:hAnsi="微软雅黑" w:eastAsia="微软雅黑"/>
-          <w:sz w:val="19"/>
-        </w:rPr>
-        <w:t xml:space="preserve">  6.99272</w:t>
-      </w:r>
-      <w:r>
-        <w:rPr>
-          <w:rFonts w:ascii="微软雅黑" w:hAnsi="微软雅黑" w:eastAsia="微软雅黑"/>
-          <w:sz w:val="19"/>
-        </w:rPr>
-        <w:t>。</w:t>
-      </w:r>
-      <w:r>
-        <w:rPr>
-          <w:rFonts w:ascii="微软雅黑" w:hAnsi="微软雅黑" w:eastAsia="微软雅黑"/>
-          <w:sz w:val="19"/>
-        </w:rPr>
-        <w:br w:type="textWrapping"/>
-      </w:r>
-      <w:r>
-        <w:rPr>
-          <w:rFonts w:ascii="微软雅黑" w:hAnsi="微软雅黑" w:eastAsia="微软雅黑"/>
-          <w:sz w:val="19"/>
-        </w:rPr>
+        <w:br/>
+        <w:t>统一案例结果（MLE）：β=1.88，η=8.50，B10=2.56098，B50=  6.99272。</w:t>
+        <w:br/>
         <w:t>本次只关注：β 的点估计值——若数据集中在 2~3 个值，务必确认使用的是 MLE 而非 LSXY，否则 β 可能算崩到 9+（完全失真）。</w:t>
-      </w:r>
-      <w:r>
-        <w:rPr>
-          <w:rFonts w:ascii="微软雅黑" w:hAnsi="微软雅黑" w:eastAsia="微软雅黑"/>
-          <w:sz w:val="19"/>
-        </w:rPr>
-        <w:br w:type="textWrapping"/>
-      </w:r>
-      <w:bookmarkStart w:id="0" w:name="_GoBack"/>
-      <w:bookmarkEnd w:id="0"/>
-      <w:r>
-        <w:rPr>
-          <w:rFonts w:hint="eastAsia" w:eastAsia="微软雅黑"/>
-          <w:lang w:eastAsia="zh-CN"/>
-        </w:rPr>
-        <w:drawing>
-          <wp:anchor distT="0" distB="0" distL="114300" distR="114300" simplePos="0" relativeHeight="251659264" behindDoc="0" locked="0" layoutInCell="1" allowOverlap="1">
-            <wp:simplePos x="0" y="0"/>
-            <wp:positionH relativeFrom="column">
-              <wp:posOffset>0</wp:posOffset>
-            </wp:positionH>
-            <wp:positionV relativeFrom="paragraph">
-              <wp:posOffset>951865</wp:posOffset>
-            </wp:positionV>
-            <wp:extent cx="5513705" cy="2191385"/>
-            <wp:effectExtent l="0" t="0" r="1270" b="8890"/>
-            <wp:wrapSquare wrapText="bothSides"/>
-            <wp:docPr id="10" name="图片 10" descr="img_v3_0213m_3dc5337a-9f53-454a-a05d-81cb5fd0285g"/>
-            <wp:cNvGraphicFramePr>
-              <a:graphicFrameLocks xmlns:a="http://schemas.openxmlformats.org/drawingml/2006/main" noChangeAspect="1"/>
-            </wp:cNvGraphicFramePr>
-            <a:graphic xmlns:a="http://schemas.openxmlformats.org/drawingml/2006/main">
-              <a:graphicData uri="http://schemas.openxmlformats.org/drawingml/2006/picture">
-                <pic:pic xmlns:pic="http://schemas.openxmlformats.org/drawingml/2006/picture">
-                  <pic:nvPicPr>
-                    <pic:cNvPr id="10" name="图片 10" descr="img_v3_0213m_3dc5337a-9f53-454a-a05d-81cb5fd0285g"/>
-                    <pic:cNvPicPr>
-                      <a:picLocks noChangeAspect="1"/>
-                    </pic:cNvPicPr>
-                  </pic:nvPicPr>
-                  <pic:blipFill>
-                    <a:blip r:embed="rId7"/>
-                    <a:stretch>
-                      <a:fillRect/>
-                    </a:stretch>
-                  </pic:blipFill>
-                  <pic:spPr>
-                    <a:xfrm>
-                      <a:off x="0" y="0"/>
-                      <a:ext cx="5513705" cy="2191385"/>
-                    </a:xfrm>
-                    <a:prstGeom prst="rect">
-                      <a:avLst/>
-                    </a:prstGeom>
-                  </pic:spPr>
-                </pic:pic>
-              </a:graphicData>
-            </a:graphic>
-          </wp:anchor>
-        </w:drawing>
+        <w:br/>
       </w:r>
     </w:p>
     <w:p>
@@ -20243,11 +20015,7 @@
     </w:p>
     <w:p>
       <w:r>
-        <w:rPr>
-          <w:rFonts w:ascii="微软雅黑" w:hAnsi="微软雅黑" w:eastAsia="微软雅黑"/>
-          <w:sz w:val="19"/>
-        </w:rPr>
-        <w:t>Weibull 特征寿命，累积失效概率达 63.2% 时对应的时间。η 越大寿命越长。传音场景：统一案例 W-795 跌落数据（MLE 估计），η=8.50 次→63.2% 的手机在 8.5 次跌落后失效。当 β=1.98&gt;1 时，中位寿命 B50=7.06 次略小于 η（8.50），符合磨损失效规律。对比：β=1（随机失效）时 B50=η*ln2≈0.693η。</w:t>
+        <w:t>Weibull 特征寿命，累积失效概率达 63.2% 时对应的时间。η 越大寿命越长。传音场景：统一案例 W-795 跌落数据（MLE 估计），η=8.50 次→63.2% 的手机在 8.5 次跌落后失效。当 β=1.88&gt;1 时，中位寿命 B50=7.06 次略小于 η（8.50），符合磨损失效规律。对比：β=1（随机失效）时 B50=η*ln2≈0.693η。</w:t>
       </w:r>
     </w:p>
     <w:p/>
@@ -21866,213 +21634,35 @@
     </w:p>
     <w:p>
       <w:r>
-        <w:rPr>
-          <w:rFonts w:ascii="微软雅黑" w:hAnsi="微软雅黑" w:eastAsia="微软雅黑"/>
-          <w:sz w:val="19"/>
-        </w:rPr>
-        <w:t>置信区间 = "真实值大概率落在哪个范围"。不要只看点估计（如 B10=2.72 次），因为单点只是一个猜测，真实值很可能上下浮动。</w:t>
-      </w:r>
-      <w:r>
-        <w:rPr>
-          <w:rFonts w:ascii="微软雅黑" w:hAnsi="微软雅黑" w:eastAsia="微软雅黑"/>
-          <w:sz w:val="19"/>
-        </w:rPr>
-        <w:br w:type="textWrapping"/>
-      </w:r>
-      <w:r>
-        <w:rPr>
-          <w:rFonts w:ascii="微软雅黑" w:hAnsi="微软雅黑" w:eastAsia="微软雅黑"/>
-          <w:sz w:val="19"/>
-        </w:rPr>
-        <w:t>传音场景：统一案例 W-795 12 台数据（MLE 估计），B10=2.72 次。如果 Minitab 能算 CI，输出会显示类似 "B10 的 95% CI: [1.8, 4.5]"——意思是：真实 B10 有 95% 概率落在 1.8~4.5 次之间。</w:t>
-      </w:r>
-      <w:r>
-        <w:rPr>
-          <w:rFonts w:ascii="微软雅黑" w:hAnsi="微软雅黑" w:eastAsia="微软雅黑"/>
-          <w:sz w:val="19"/>
-        </w:rPr>
-        <w:br w:type="textWrapping"/>
-      </w:r>
-      <w:r>
-        <w:rPr>
-          <w:rFonts w:ascii="微软雅黑" w:hAnsi="微软雅黑" w:eastAsia="微软雅黑"/>
-          <w:sz w:val="19"/>
-        </w:rPr>
-        <w:t>为什么 CI 很重要：如果只报 B10=2.72，研发会觉得"2.72次就出问题"；但如果 CI 是 [1.2, 4.8]，实际上真实值可能高达 4.8 次——这个区间信息直接影响整改优先级判断。</w:t>
-      </w:r>
-      <w:r>
-        <w:rPr>
-          <w:rFonts w:ascii="微软雅黑" w:hAnsi="微软雅黑" w:eastAsia="微软雅黑"/>
-          <w:sz w:val="19"/>
-        </w:rPr>
-        <w:br w:type="textWrapping"/>
-      </w:r>
-      <w:r>
-        <w:rPr>
-          <w:rFonts w:ascii="微软雅黑" w:hAnsi="微软雅黑" w:eastAsia="微软雅黑"/>
-          <w:sz w:val="19"/>
-        </w:rPr>
+        <w:t>置信区间 = "真实值大概率落在哪个范围"。不要只看点估计（如 B10=2.56098 次），因为单点只是一个猜测，真实值很可能上下浮动。</w:t>
+        <w:br/>
+        <w:t>传音场景：统一案例 W-795 12 台数据（MLE 估计），B10=2.56098 次。如果 Minitab 能算 CI，输出会显示类似 "B10 的 95% CI: [1.8, 4.5]"——意思是：真实 B10 有 95% 概率落在 1.8~4.5 次之间。</w:t>
+        <w:br/>
+        <w:t>为什么 CI 很重要：如果只报 B10=2.56098，研发会觉得"2.56098次就出问题"；但如果 CI 是 [1.2, 4.8]，实际上真实值可能高达 4.8 次——这个区间信息直接影响整改优先级判断。</w:t>
+        <w:br/>
         <w:t>CI 怎么算：Minitab 基于极大似然估计，用 Fisher 信息矩阵推导标准误，再乘 t 分布分位数。失效数越多、数据越分散，标准误越小，CI 越窄。</w:t>
-      </w:r>
-      <w:r>
-        <w:rPr>
-          <w:rFonts w:ascii="微软雅黑" w:hAnsi="微软雅黑" w:eastAsia="微软雅黑"/>
-          <w:sz w:val="19"/>
-        </w:rPr>
-        <w:br w:type="textWrapping"/>
-      </w:r>
-      <w:r>
-        <w:rPr>
-          <w:rFonts w:ascii="微软雅黑" w:hAnsi="微软雅黑" w:eastAsia="微软雅黑"/>
-          <w:sz w:val="19"/>
-        </w:rPr>
+        <w:br/>
         <w:t>本案例特殊情况：12 台/8 失效，数据高度集中在 4 和 5 两个值，信息不足 → Minitab 未能输出 CI。这是正常的，不代表操作错误。</w:t>
-      </w:r>
-      <w:r>
-        <w:rPr>
-          <w:rFonts w:ascii="微软雅黑" w:hAnsi="微软雅黑" w:eastAsia="微软雅黑"/>
-          <w:sz w:val="19"/>
-        </w:rPr>
-        <w:br w:type="textWrapping"/>
-      </w:r>
-      <w:r>
-        <w:rPr>
-          <w:rFonts w:ascii="微软雅黑" w:hAnsi="微软雅黑" w:eastAsia="微软雅黑"/>
-          <w:sz w:val="19"/>
-        </w:rPr>
+        <w:br/>
         <w:t>一般规律：失效数≥15 且数据分散时，CI 宽度明显收窄；失效数&lt;10 时 CI 很宽，点估计参考价值有限。正式报告建议攒到 ≥15 个失效数据。</w:t>
-      </w:r>
-      <w:r>
-        <w:rPr>
-          <w:rFonts w:ascii="微软雅黑" w:hAnsi="微软雅黑" w:eastAsia="微软雅黑"/>
-          <w:sz w:val="19"/>
-        </w:rPr>
-        <w:br w:type="textWrapping"/>
-      </w:r>
-      <w:r>
-        <w:rPr>
-          <w:rFonts w:ascii="微软雅黑" w:hAnsi="微软雅黑" w:eastAsia="微软雅黑"/>
-          <w:sz w:val="19"/>
-        </w:rPr>
-        <w:br w:type="textWrapping"/>
-      </w:r>
-      <w:r>
-        <w:rPr>
-          <w:rFonts w:ascii="微软雅黑" w:hAnsi="微软雅黑" w:eastAsia="微软雅黑"/>
-          <w:sz w:val="19"/>
-        </w:rPr>
+        <w:br/>
+        <w:br/>
         <w:t>操作步骤（Minitab 15）：</w:t>
-      </w:r>
-      <w:r>
-        <w:rPr>
-          <w:rFonts w:ascii="微软雅黑" w:hAnsi="微软雅黑" w:eastAsia="微软雅黑"/>
-          <w:sz w:val="19"/>
-        </w:rPr>
-        <w:br w:type="textWrapping"/>
-      </w:r>
-      <w:r>
-        <w:rPr>
-          <w:rFonts w:ascii="微软雅黑" w:hAnsi="微软雅黑" w:eastAsia="微软雅黑"/>
-          <w:sz w:val="19"/>
-        </w:rPr>
+        <w:br/>
         <w:t xml:space="preserve">  ① 菜单：统计 → 可靠性/生存 → 参数分布分析（右删失）</w:t>
-      </w:r>
-      <w:r>
-        <w:rPr>
-          <w:rFonts w:ascii="微软雅黑" w:hAnsi="微软雅黑" w:eastAsia="微软雅黑"/>
-          <w:sz w:val="19"/>
-        </w:rPr>
-        <w:br w:type="textWrapping"/>
-      </w:r>
-      <w:r>
-        <w:rPr>
-          <w:rFonts w:ascii="微软雅黑" w:hAnsi="微软雅黑" w:eastAsia="微软雅黑"/>
-          <w:sz w:val="19"/>
-        </w:rPr>
+        <w:br/>
         <w:t xml:space="preserve">  ② 变量(V)：C1（失效次数），删失(C)：C2（删失列），删失值 = 1</w:t>
-      </w:r>
-      <w:r>
-        <w:rPr>
-          <w:rFonts w:ascii="微软雅黑" w:hAnsi="微软雅黑" w:eastAsia="微软雅黑"/>
-          <w:sz w:val="19"/>
-        </w:rPr>
-        <w:br w:type="textWrapping"/>
-      </w:r>
-      <w:r>
-        <w:rPr>
-          <w:rFonts w:ascii="微软雅黑" w:hAnsi="微软雅黑" w:eastAsia="微软雅黑"/>
-          <w:sz w:val="19"/>
-        </w:rPr>
+        <w:br/>
         <w:t xml:space="preserve">  ③ 假设分布：威布尔；估计法：极大似然</w:t>
-      </w:r>
-      <w:r>
-        <w:rPr>
-          <w:rFonts w:ascii="微软雅黑" w:hAnsi="微软雅黑" w:eastAsia="微软雅黑"/>
-          <w:sz w:val="19"/>
-        </w:rPr>
-        <w:br w:type="textWrapping"/>
-      </w:r>
-      <w:r>
-        <w:rPr>
-          <w:rFonts w:ascii="微软雅黑" w:hAnsi="微软雅黑" w:eastAsia="微软雅黑"/>
-          <w:sz w:val="19"/>
-        </w:rPr>
+        <w:br/>
         <w:t xml:space="preserve">  ④ 关键一步：点"图形(G)..."按钮 → 在弹出的图形对话框中，勾选"在概率图中显示置信区间(S)"</w:t>
-      </w:r>
-      <w:r>
-        <w:rPr>
-          <w:rFonts w:ascii="微软雅黑" w:hAnsi="微软雅黑" w:eastAsia="微软雅黑"/>
-          <w:sz w:val="19"/>
-        </w:rPr>
-        <w:br w:type="textWrapping"/>
-      </w:r>
-      <w:r>
-        <w:rPr>
-          <w:rFonts w:ascii="微软雅黑" w:hAnsi="微软雅黑" w:eastAsia="微软雅黑"/>
-          <w:sz w:val="19"/>
-        </w:rPr>
+        <w:br/>
         <w:t xml:space="preserve">  ⑤ 确定 → 确定，Minitab 会在概率图上画出两条虚线（95% CI 带）</w:t>
-      </w:r>
-      <w:r>
-        <w:rPr>
-          <w:rFonts w:ascii="微软雅黑" w:hAnsi="微软雅黑" w:eastAsia="微软雅黑"/>
-          <w:sz w:val="19"/>
-        </w:rPr>
-        <w:br w:type="textWrapping"/>
-      </w:r>
-      <w:r>
-        <w:rPr>
-          <w:rFonts w:ascii="微软雅黑" w:hAnsi="微软雅黑" w:eastAsia="微软雅黑"/>
-          <w:sz w:val="19"/>
-        </w:rPr>
+        <w:br/>
         <w:t xml:space="preserve">  ⑥ 同时输出窗口会列出各百分位点（B1/B5/B10/B50）的点估计 + 95% 双侧置信区间</w:t>
-      </w:r>
-      <w:r>
-        <w:rPr>
-          <w:rFonts w:ascii="微软雅黑" w:hAnsi="微软雅黑" w:eastAsia="微软雅黑"/>
-          <w:sz w:val="19"/>
-        </w:rPr>
-        <w:br w:type="textWrapping"/>
-      </w:r>
-      <w:r>
-        <w:rPr>
-          <w:rFonts w:ascii="微软雅黑" w:hAnsi="微软雅黑" w:eastAsia="微软雅黑"/>
-          <w:sz w:val="19"/>
-        </w:rPr>
+        <w:br/>
         <w:t>⚠ 注意：W-795 案例数据（12 台，数据集中在 4~5 次）信息量不足，Minitab 可能仍无法计算 CI——此时概率图只有一条拟合直线，无 CI 带。这是数据本身的问题，不是操作错误。以下提供一组"分散型"示例数据（20 台，失效从 1~18 次分散分布），专门用于演示 CI 效果。</w:t>
-      </w:r>
-      <w:r>
-        <w:rPr>
-          <w:rFonts w:ascii="微软雅黑" w:hAnsi="微软雅黑" w:eastAsia="微软雅黑"/>
-          <w:sz w:val="19"/>
-        </w:rPr>
-        <w:br w:type="textWrapping"/>
-      </w:r>
-      <w:r>
-        <w:rPr>
-          <w:rFonts w:ascii="微软雅黑" w:hAnsi="微软雅黑" w:eastAsia="微软雅黑"/>
-          <w:sz w:val="19"/>
-        </w:rPr>
+        <w:br/>
         <w:t>▎CI 演示数据（20 台，分散型，可出 CI）——复制到 C1/C2。下方数据按行号顺序复制到 Minitab 即可。用这组数据按步骤①~⑤操作，Minitab 会在概率图上生成"拟合直线 + 上下两条虚线"——那就是 95% CI 带。输出窗口也会显示完整的百分位 CI 表。</w:t>
       </w:r>
     </w:p>
@@ -26973,12 +26563,7 @@
     <w:p/>
     <w:p>
       <w:r>
-        <w:rPr>
-          <w:rFonts w:ascii="微软雅黑" w:hAnsi="微软雅黑" w:eastAsia="微软雅黑"/>
-          <w:b/>
-          <w:sz w:val="20"/>
-        </w:rPr>
-        <w:t>第10题：Log-Rank p=0.003 结论？</w:t>
+        <w:t>第10题：Log-Rank p=0.019 结论？</w:t>
       </w:r>
     </w:p>
     <w:p>

</xml_diff>

<commit_message>
fix: 手册附录统一列结构 C1/C2/C3，统一数据为 4,4,4,5,5,5,5,5,10,10,10,10
</commit_message>
<xml_diff>
--- a/source/Minitab应用实战手册_V1.5_OpenClaw版.docx
+++ b/source/Minitab应用实战手册_V1.5_OpenClaw版.docx
@@ -28866,11 +28866,7 @@
     </w:p>
     <w:p>
       <w:r>
-        <w:rPr>
-          <w:rFonts w:ascii="微软雅黑" w:hAnsi="微软雅黑" w:eastAsia="微软雅黑"/>
-          <w:sz w:val="18"/>
-        </w:rPr>
-        <w:t>C2（样品编号）可选填，C3 删失标记为 0（失效）或 1（全过）。</w:t>
+        <w:t>C1=失效次数，C2=删失标记（0=失效，1=全过）。数据：4,4,4,5,5,5,5,5,10,10,10,10（12台）。</w:t>
       </w:r>
     </w:p>
     <w:tbl>
@@ -30116,12 +30112,7 @@
     <w:p/>
     <w:p>
       <w:r>
-        <w:rPr>
-          <w:rFonts w:ascii="微软雅黑" w:hAnsi="微软雅黑" w:eastAsia="微软雅黑"/>
-          <w:i/>
-          <w:sz w:val="18"/>
-        </w:rPr>
-        <w:t>操作：统计 → 可靠性/生存 → 分布分析(右删失) → 参数分布分析(P)... → 变量=C1，删失列=C3，删失值=1，假定分布=Weibull</w:t>
+        <w:t>操作：统计 → 可靠性/生存 → 分布分析(右删失) → 参数分布分析(P)... → 变量=C1，删失列=C2，删失值=1，假定分布=Weibull</w:t>
       </w:r>
     </w:p>
     <w:p/>
@@ -31607,11 +31598,7 @@
     </w:p>
     <w:p>
       <w:r>
-        <w:rPr>
-          <w:rFonts w:ascii="微软雅黑" w:hAnsi="微软雅黑" w:eastAsia="微软雅黑"/>
-          <w:sz w:val="18"/>
-        </w:rPr>
-        <w:t>C3=0（失效）/1（全过），C4 为组别标记。整表复制到 Minitab 后走 KM 分析。</w:t>
+        <w:t>C1=失效次数，C2=删失标记（0=失效/1=全过），C3=组别（整改前/整改后）。整表复制到 Minitab 后走 KM 分析。</w:t>
       </w:r>
     </w:p>
     <w:p>
@@ -35114,12 +35101,7 @@
     <w:p/>
     <w:p>
       <w:r>
-        <w:rPr>
-          <w:rFonts w:ascii="微软雅黑" w:hAnsi="微软雅黑" w:eastAsia="微软雅黑"/>
-          <w:i/>
-          <w:sz w:val="18"/>
-        </w:rPr>
-        <w:t>操作：统计 → 可靠性/生存 → 非参数分布分析(右删失) → 时间列=C1，删失列=C3，删失值=1，按变量(B)=C4 → 图形勾选"生存图"，结果(R)选"对数排秩和 Wilcoxon 统计量"</w:t>
+        <w:t>操作：统计 → 可靠性/生存 → 非参数分布分析（右删失） → 时间列=C1，删失列=C2，删失值=1，按变量(B)=C3 → 图形勾选"生存图"，结果(R)选"对数排秩和 Wilcoxon 统计量"</w:t>
       </w:r>
     </w:p>
     <w:p>

</xml_diff>